<commit_message>
Add Fields Medalists Deng & Wang resonance + Hilbert's sixth problem (EN/ZH)
- Deng (Yu): emergence is mathematically proven, not a metaphor (Ch.1, after temperature)
- Wang (Hong): Kakeya conjecture — continuous space is far from simple (Ch.1)
- Both juxtaposed + Hilbert's sixth problem 'one axiom solves everything' (Ch.7/8 boundary)
</commit_message>
<xml_diff>
--- a/docs/From Change to Everything - A Popular Science Introduction.docx
+++ b/docs/From Change to Everything - A Popular Science Introduction.docx
@@ -851,6 +851,120 @@
           <w:color w:val="2E6B3A"/>
           <w:sz w:val="26"/>
         </w:rPr>
+        <w:t>Wait a moment — "emergence" is not a metaphor; it is mathematically proven</w:t>
+      </w:r>
+    </w:p>
+    <w:p>
+      <w:pPr>
+        <w:spacing w:after="80" w:line="300" w:lineRule="auto"/>
+      </w:pPr>
+      <w:r>
+        <w:rPr>
+          <w:rFonts w:ascii="Calibri" w:hAnsi="Calibri" w:eastAsia="Calibri"/>
+          <w:sz w:val="22"/>
+        </w:rPr>
+        <w:t>You might wonder: is the claim "temperature is emergent" just a nice metaphor?</w:t>
+      </w:r>
+    </w:p>
+    <w:p>
+      <w:pPr>
+        <w:spacing w:after="80" w:line="300" w:lineRule="auto"/>
+      </w:pPr>
+      <w:r>
+        <w:rPr>
+          <w:rFonts w:ascii="Calibri" w:hAnsi="Calibri" w:eastAsia="Calibri"/>
+          <w:b/>
+          <w:sz w:val="22"/>
+        </w:rPr>
+        <w:t>Yu Deng, a 2026 Fields Medalist, answered this question with mathematics.</w:t>
+      </w:r>
+    </w:p>
+    <w:p>
+      <w:pPr>
+        <w:spacing w:after="80" w:line="300" w:lineRule="auto"/>
+      </w:pPr>
+      <w:r>
+        <w:rPr>
+          <w:rFonts w:ascii="Calibri" w:hAnsi="Calibri" w:eastAsia="Calibri"/>
+          <w:sz w:val="22"/>
+        </w:rPr>
+        <w:t xml:space="preserve">In plain terms, Deng's work proves: </w:t>
+      </w:r>
+      <w:r>
+        <w:rPr>
+          <w:rFonts w:ascii="Calibri" w:hAnsi="Calibri" w:eastAsia="Calibri"/>
+          <w:b/>
+          <w:sz w:val="22"/>
+        </w:rPr>
+        <w:t>a room full of chaotically bouncing marbles (microscopic particles) really does "emerge" into temperature, pressure, and fluid motion (macroscopic laws).</w:t>
+      </w:r>
+      <w:r>
+        <w:rPr>
+          <w:rFonts w:ascii="Calibri" w:hAnsi="Calibri" w:eastAsia="Calibri"/>
+          <w:sz w:val="22"/>
+        </w:rPr>
+        <w:t xml:space="preserve"> This is not philosophical musing; it is a rigorous mathematical proof — starting from Newtonian mechanics and, through extremely intricate derivation, ending at the equations that describe the flow of a gas.</w:t>
+      </w:r>
+    </w:p>
+    <w:p>
+      <w:pPr>
+        <w:spacing w:after="80" w:line="300" w:lineRule="auto"/>
+      </w:pPr>
+      <w:r>
+        <w:rPr>
+          <w:rFonts w:ascii="Calibri" w:hAnsi="Calibri" w:eastAsia="Calibri"/>
+          <w:sz w:val="22"/>
+        </w:rPr>
+        <w:t xml:space="preserve">This means: </w:t>
+      </w:r>
+      <w:r>
+        <w:rPr>
+          <w:rFonts w:ascii="Calibri" w:hAnsi="Calibri" w:eastAsia="Calibri"/>
+          <w:b/>
+          <w:sz w:val="22"/>
+        </w:rPr>
+        <w:t>"emergence" is not a vague concept but a mathematical fact that can be verified and computed.</w:t>
+      </w:r>
+      <w:r>
+        <w:rPr>
+          <w:rFonts w:ascii="Calibri" w:hAnsi="Calibri" w:eastAsia="Calibri"/>
+          <w:sz w:val="22"/>
+        </w:rPr>
+        <w:t xml:space="preserve"> Temperature is not a property "imposed on" molecules from outside; it is a structure that forms spontaneously from the collective motion of molecules. Gravity is the same — not a property "imposed on" the vacuum, but a structure that forms spontaneously from the collective motion of vacuum fluctuations.</w:t>
+      </w:r>
+    </w:p>
+    <w:p>
+      <w:pPr>
+        <w:spacing w:after="80" w:line="300" w:lineRule="auto"/>
+      </w:pPr>
+      <w:r>
+        <w:rPr>
+          <w:rFonts w:ascii="Calibri" w:hAnsi="Calibri" w:eastAsia="Calibri"/>
+          <w:sz w:val="22"/>
+        </w:rPr>
+        <w:t xml:space="preserve">Deng proved that the microscopic can emerge into the macroscopic. </w:t>
+      </w:r>
+      <w:r>
+        <w:rPr>
+          <w:rFonts w:ascii="Calibri" w:hAnsi="Calibri" w:eastAsia="Calibri"/>
+          <w:b/>
+          <w:sz w:val="22"/>
+        </w:rPr>
+        <w:t>What our framework aims to prove is: change can emerge into spacetime.</w:t>
+      </w:r>
+    </w:p>
+    <w:p>
+      <w:pPr>
+        <w:pStyle w:val="Heading3"/>
+        <w:spacing w:before="200" w:after="120"/>
+      </w:pPr>
+      <w:r>
+        <w:rPr>
+          <w:rFonts w:ascii="Calibri" w:hAnsi="Calibri" w:eastAsia="Calibri"/>
+          <w:b/>
+          <w:color w:val="2E6B3A"/>
+          <w:sz w:val="26"/>
+        </w:rPr>
         <w:t>Gravity emerges just like temperature</w:t>
       </w:r>
     </w:p>
@@ -1304,6 +1418,211 @@
           <w:sz w:val="22"/>
         </w:rPr>
         <w:t>An analogy: you see a whirlpool on a river and say "the riverbed must be dented here." One can also look at it another way: the riverbed does not exist at all; what actually changes is the water itself. Einstein's equations precisely describe the "whirlpool," simply attributing it to a "dented riverbed"; and we may attribute it differently — what really "curves" and "changes" is the water (vacuum fluctuations), not the riverbed (spacetime).</w:t>
+      </w:r>
+    </w:p>
+    <w:p>
+      <w:pPr>
+        <w:pStyle w:val="Heading3"/>
+        <w:spacing w:before="200" w:after="120"/>
+      </w:pPr>
+      <w:r>
+        <w:rPr>
+          <w:rFonts w:ascii="Calibri" w:hAnsi="Calibri" w:eastAsia="Calibri"/>
+          <w:b/>
+          <w:color w:val="2E6B3A"/>
+          <w:sz w:val="26"/>
+        </w:rPr>
+        <w:t>Space is continuous, but that does not mean it is "simple"</w:t>
+      </w:r>
+    </w:p>
+    <w:p>
+      <w:pPr>
+        <w:spacing w:after="80" w:line="300" w:lineRule="auto"/>
+      </w:pPr>
+      <w:r>
+        <w:rPr>
+          <w:rFonts w:ascii="Calibri" w:hAnsi="Calibri" w:eastAsia="Calibri"/>
+          <w:sz w:val="22"/>
+        </w:rPr>
+        <w:t>The work of another 2026 Fields Medalist — Hong Wang — touches the essence of "space" from a completely different angle.</w:t>
+      </w:r>
+    </w:p>
+    <w:p>
+      <w:pPr>
+        <w:spacing w:after="80" w:line="300" w:lineRule="auto"/>
+      </w:pPr>
+      <w:r>
+        <w:rPr>
+          <w:rFonts w:ascii="Calibri" w:hAnsi="Calibri" w:eastAsia="Calibri"/>
+          <w:sz w:val="22"/>
+        </w:rPr>
+        <w:t xml:space="preserve">Wang proved a problem that had troubled mathematics for a century: the </w:t>
+      </w:r>
+      <w:r>
+        <w:rPr>
+          <w:rFonts w:ascii="Calibri" w:hAnsi="Calibri" w:eastAsia="Calibri"/>
+          <w:b/>
+          <w:sz w:val="22"/>
+        </w:rPr>
+        <w:t>three-dimensional Kakeya conjecture</w:t>
+      </w:r>
+      <w:r>
+        <w:rPr>
+          <w:rFonts w:ascii="Calibri" w:hAnsi="Calibri" w:eastAsia="Calibri"/>
+          <w:sz w:val="22"/>
+        </w:rPr>
+        <w:t>. The conjecture asks: a needle that is infinitely thin can point in every direction within a space — how small can that space be?</w:t>
+      </w:r>
+    </w:p>
+    <w:p>
+      <w:pPr>
+        <w:spacing w:after="80" w:line="300" w:lineRule="auto"/>
+      </w:pPr>
+      <w:r>
+        <w:rPr>
+          <w:rFonts w:ascii="Calibri" w:hAnsi="Calibri" w:eastAsia="Calibri"/>
+          <w:sz w:val="22"/>
+        </w:rPr>
+        <w:t xml:space="preserve">The answer is surprising: in three dimensions, </w:t>
+      </w:r>
+      <w:r>
+        <w:rPr>
+          <w:rFonts w:ascii="Calibri" w:hAnsi="Calibri" w:eastAsia="Calibri"/>
+          <w:b/>
+          <w:sz w:val="22"/>
+        </w:rPr>
+        <w:t>there is a positive minimum volume</w:t>
+      </w:r>
+      <w:r>
+        <w:rPr>
+          <w:rFonts w:ascii="Calibri" w:hAnsi="Calibri" w:eastAsia="Calibri"/>
+          <w:sz w:val="22"/>
+        </w:rPr>
+        <w:t>. You cannot compress "a needle that can point in every direction" down to arbitrarily small size.</w:t>
+      </w:r>
+    </w:p>
+    <w:p>
+      <w:pPr>
+        <w:spacing w:after="80" w:line="300" w:lineRule="auto"/>
+      </w:pPr>
+      <w:r>
+        <w:rPr>
+          <w:rFonts w:ascii="Calibri" w:hAnsi="Calibri" w:eastAsia="Calibri"/>
+          <w:sz w:val="22"/>
+        </w:rPr>
+        <w:t xml:space="preserve">What does this mean? </w:t>
+      </w:r>
+      <w:r>
+        <w:rPr>
+          <w:rFonts w:ascii="Calibri" w:hAnsi="Calibri" w:eastAsia="Calibri"/>
+          <w:b/>
+          <w:sz w:val="22"/>
+        </w:rPr>
+        <w:t>It means "continuous space" is not a monolithic, simple concept.</w:t>
+      </w:r>
+      <w:r>
+        <w:rPr>
+          <w:rFonts w:ascii="Calibri" w:hAnsi="Calibri" w:eastAsia="Calibri"/>
+          <w:sz w:val="22"/>
+        </w:rPr>
+        <w:t xml:space="preserve"> At microscopic scales, the structure of continuous space can become extremely intricate, extremely "non-smooth." Wang's work reveals: </w:t>
+      </w:r>
+      <w:r>
+        <w:rPr>
+          <w:rFonts w:ascii="Calibri" w:hAnsi="Calibri" w:eastAsia="Calibri"/>
+          <w:b/>
+          <w:sz w:val="22"/>
+        </w:rPr>
+        <w:t>between the continuous and the discrete, there is a far richer relation than we imagined.</w:t>
+      </w:r>
+    </w:p>
+    <w:p>
+      <w:pPr>
+        <w:spacing w:after="80" w:line="300" w:lineRule="auto"/>
+      </w:pPr>
+      <w:r>
+        <w:rPr>
+          <w:rFonts w:ascii="Calibri" w:hAnsi="Calibri" w:eastAsia="Calibri"/>
+          <w:sz w:val="22"/>
+        </w:rPr>
+        <w:t xml:space="preserve">There is a beautiful symmetry here: </w:t>
+      </w:r>
+      <w:r>
+        <w:rPr>
+          <w:rFonts w:ascii="Calibri" w:hAnsi="Calibri" w:eastAsia="Calibri"/>
+          <w:b/>
+          <w:sz w:val="22"/>
+        </w:rPr>
+        <w:t>Deng studies "how a crowd of particles forms a continuous field"; Wang studies "how a wave field reveals grain-like structure."</w:t>
+      </w:r>
+      <w:r>
+        <w:rPr>
+          <w:rFonts w:ascii="Calibri" w:hAnsi="Calibri" w:eastAsia="Calibri"/>
+          <w:sz w:val="22"/>
+        </w:rPr>
+        <w:t xml:space="preserve"> One goes from the discrete to the continuous, the other from the continuous to the discrete — </w:t>
+      </w:r>
+      <w:r>
+        <w:rPr>
+          <w:rFonts w:ascii="Calibri" w:hAnsi="Calibri" w:eastAsia="Calibri"/>
+          <w:b/>
+          <w:sz w:val="22"/>
+        </w:rPr>
+        <w:t>together they tell us: the continuous and the discrete are not an either/or opposition, but two faces of one world at different scales.</w:t>
+      </w:r>
+    </w:p>
+    <w:p>
+      <w:pPr>
+        <w:spacing w:after="80" w:line="300" w:lineRule="auto"/>
+      </w:pPr>
+      <w:r>
+        <w:rPr>
+          <w:rFonts w:ascii="Calibri" w:hAnsi="Calibri" w:eastAsia="Calibri"/>
+          <w:sz w:val="22"/>
+        </w:rPr>
+        <w:t xml:space="preserve">Our framework goes one step further: </w:t>
+      </w:r>
+      <w:r>
+        <w:rPr>
+          <w:rFonts w:ascii="Calibri" w:hAnsi="Calibri" w:eastAsia="Calibri"/>
+          <w:b/>
+          <w:sz w:val="22"/>
+        </w:rPr>
+        <w:t>even "space" itself emerges from the spectrum of "change."</w:t>
+      </w:r>
+      <w:r>
+        <w:rPr>
+          <w:rFonts w:ascii="Calibri" w:hAnsi="Calibri" w:eastAsia="Calibri"/>
+          <w:sz w:val="22"/>
+        </w:rPr>
+        <w:t xml:space="preserve"> Wang proved that continuous space can be very complex; we say that even the concept "continuous" is itself derivative.</w:t>
+      </w:r>
+    </w:p>
+    <w:p>
+      <w:pPr>
+        <w:spacing w:after="80" w:line="300" w:lineRule="auto"/>
+      </w:pPr>
+      <w:r>
+        <w:rPr>
+          <w:rFonts w:ascii="Calibri" w:hAnsi="Calibri" w:eastAsia="Calibri"/>
+          <w:sz w:val="22"/>
+        </w:rPr>
+        <w:t xml:space="preserve">Wang's work points, unintentionally, to a deeper question: </w:t>
+      </w:r>
+      <w:r>
+        <w:rPr>
+          <w:rFonts w:ascii="Calibri" w:hAnsi="Calibri" w:eastAsia="Calibri"/>
+          <w:b/>
+          <w:sz w:val="22"/>
+        </w:rPr>
+        <w:t>if "continuous space" can be this complex at the microscopic level, how can it be "fundamental"? A fundamental thing should be simple. The very complexity of space shows that it is not a source but a result — something that emerges from something simpler.</w:t>
+      </w:r>
+      <w:r>
+        <w:rPr>
+          <w:rFonts w:ascii="Calibri" w:hAnsi="Calibri" w:eastAsia="Calibri"/>
+          <w:sz w:val="22"/>
+        </w:rPr>
+        <w:t xml:space="preserve"> That simpler thing, in our framework, is "change."</w:t>
       </w:r>
     </w:p>
     <w:p>
@@ -6417,6 +6736,377 @@
           <w:sz w:val="22"/>
         </w:rPr>
         <w:t>they all still need some pre-existing "something" (strings, loops, a boundary), whereas we have done away with that "something" too, leaving only "change itself."</w:t>
+      </w:r>
+    </w:p>
+    <w:p>
+      <w:pPr>
+        <w:pStyle w:val="Heading3"/>
+        <w:spacing w:before="200" w:after="120"/>
+      </w:pPr>
+      <w:r>
+        <w:rPr>
+          <w:rFonts w:ascii="Calibri" w:hAnsi="Calibri" w:eastAsia="Calibri"/>
+          <w:b/>
+          <w:color w:val="2E6B3A"/>
+          <w:sz w:val="26"/>
+        </w:rPr>
+        <w:t>Coincidence or necessity? — what the 2026 Fields Medals tell us</w:t>
+      </w:r>
+    </w:p>
+    <w:p>
+      <w:pPr>
+        <w:spacing w:after="80" w:line="300" w:lineRule="auto"/>
+      </w:pPr>
+      <w:r>
+        <w:rPr>
+          <w:rFonts w:ascii="Calibri" w:hAnsi="Calibri" w:eastAsia="Calibri"/>
+          <w:sz w:val="22"/>
+        </w:rPr>
+        <w:t>In 2026, two Chinese mathematicians received the Fields Medal at the same time.</w:t>
+      </w:r>
+    </w:p>
+    <w:p>
+      <w:pPr>
+        <w:spacing w:after="80" w:line="300" w:lineRule="auto"/>
+      </w:pPr>
+      <w:r>
+        <w:rPr>
+          <w:rFonts w:ascii="Calibri" w:hAnsi="Calibri" w:eastAsia="Calibri"/>
+          <w:sz w:val="22"/>
+        </w:rPr>
+        <w:t xml:space="preserve">Deng's work proves: </w:t>
+      </w:r>
+      <w:r>
+        <w:rPr>
+          <w:rFonts w:ascii="Calibri" w:hAnsi="Calibri" w:eastAsia="Calibri"/>
+          <w:b/>
+          <w:sz w:val="22"/>
+        </w:rPr>
+        <w:t>microscopic particles can emerge into macroscopic temperature, pressure, and fluids.</w:t>
+      </w:r>
+      <w:r>
+        <w:rPr>
+          <w:rFonts w:ascii="Calibri" w:hAnsi="Calibri" w:eastAsia="Calibri"/>
+          <w:sz w:val="22"/>
+        </w:rPr>
+        <w:t xml:space="preserve"> Wang's work reveals: </w:t>
+      </w:r>
+      <w:r>
+        <w:rPr>
+          <w:rFonts w:ascii="Calibri" w:hAnsi="Calibri" w:eastAsia="Calibri"/>
+          <w:b/>
+          <w:sz w:val="22"/>
+        </w:rPr>
+        <w:t>continuous space can, at microscopic scales, show an astonishing, almost-discrete complexity.</w:t>
+      </w:r>
+    </w:p>
+    <w:p>
+      <w:pPr>
+        <w:spacing w:after="80" w:line="300" w:lineRule="auto"/>
+      </w:pPr>
+      <w:r>
+        <w:rPr>
+          <w:rFonts w:ascii="Calibri" w:hAnsi="Calibri" w:eastAsia="Calibri"/>
+          <w:sz w:val="22"/>
+        </w:rPr>
+        <w:t>One looks upward from below (discrete → continuous); the other looks downward from above (continuous → discrete). They are like two mirrors reflecting each other.</w:t>
+      </w:r>
+    </w:p>
+    <w:p>
+      <w:pPr>
+        <w:spacing w:after="80" w:line="300" w:lineRule="auto"/>
+      </w:pPr>
+      <w:r>
+        <w:rPr>
+          <w:rFonts w:ascii="Calibri" w:hAnsi="Calibri" w:eastAsia="Calibri"/>
+          <w:sz w:val="22"/>
+        </w:rPr>
+        <w:t xml:space="preserve">And our framework stands at their crossing point: </w:t>
+      </w:r>
+      <w:r>
+        <w:rPr>
+          <w:rFonts w:ascii="Calibri" w:hAnsi="Calibri" w:eastAsia="Calibri"/>
+          <w:b/>
+          <w:sz w:val="22"/>
+        </w:rPr>
+        <w:t>if the microscopic can emerge into the macroscopic (Deng), and if the continuous can expose the complexity of the discrete (Wang), then why cannot "spacetime" itself emerge from something more fundamental — change?</w:t>
+      </w:r>
+    </w:p>
+    <w:p>
+      <w:pPr>
+        <w:spacing w:after="80" w:line="300" w:lineRule="auto"/>
+      </w:pPr>
+      <w:r>
+        <w:rPr>
+          <w:rFonts w:ascii="Calibri" w:hAnsi="Calibri" w:eastAsia="Calibri"/>
+          <w:sz w:val="22"/>
+        </w:rPr>
+        <w:t xml:space="preserve">Behind this there is an even grander story — </w:t>
+      </w:r>
+      <w:r>
+        <w:rPr>
+          <w:rFonts w:ascii="Calibri" w:hAnsi="Calibri" w:eastAsia="Calibri"/>
+          <w:b/>
+          <w:sz w:val="22"/>
+        </w:rPr>
+        <w:t>Hilbert's sixth problem</w:t>
+      </w:r>
+      <w:r>
+        <w:rPr>
+          <w:rFonts w:ascii="Calibri" w:hAnsi="Calibri" w:eastAsia="Calibri"/>
+          <w:sz w:val="22"/>
+        </w:rPr>
+        <w:t>.</w:t>
+      </w:r>
+    </w:p>
+    <w:p>
+      <w:pPr>
+        <w:spacing w:after="80" w:line="300" w:lineRule="auto"/>
+      </w:pPr>
+      <w:r>
+        <w:rPr>
+          <w:rFonts w:ascii="Calibri" w:hAnsi="Calibri" w:eastAsia="Calibri"/>
+          <w:sz w:val="22"/>
+        </w:rPr>
+        <w:t xml:space="preserve">In 1900, the mathematician David Hilbert posed 23 problems that would point the direction for all of twentieth-century mathematics. The sixth is special: it is not a concrete conjecture but a grand program — </w:t>
+      </w:r>
+      <w:r>
+        <w:rPr>
+          <w:rFonts w:ascii="Calibri" w:hAnsi="Calibri" w:eastAsia="Calibri"/>
+          <w:b/>
+          <w:sz w:val="22"/>
+        </w:rPr>
+        <w:t>"the axiomatisation of physics."</w:t>
+      </w:r>
+      <w:r>
+        <w:rPr>
+          <w:rFonts w:ascii="Calibri" w:hAnsi="Calibri" w:eastAsia="Calibri"/>
+          <w:sz w:val="22"/>
+        </w:rPr>
+        <w:t xml:space="preserve"> In plain terms: can we, as Euclid did for geometry, find a minimal set of axioms for all of physics, and then derive every physical law from them?</w:t>
+      </w:r>
+    </w:p>
+    <w:p>
+      <w:pPr>
+        <w:spacing w:after="80" w:line="300" w:lineRule="auto"/>
+      </w:pPr>
+      <w:r>
+        <w:rPr>
+          <w:rFonts w:ascii="Calibri" w:hAnsi="Calibri" w:eastAsia="Calibri"/>
+          <w:sz w:val="22"/>
+        </w:rPr>
+        <w:t xml:space="preserve">One of its concrete versions is the axiomatisation of fluid mechanics: microscopically, a single molecule obeys Newtonian mechanics (reversible, no direction of time); macroscopically, a gas made of countless molecules exhibits temperature, pressure, and viscosity, and obeys the second law of thermodynamics (irreversible, with an arrow of time). </w:t>
+      </w:r>
+      <w:r>
+        <w:rPr>
+          <w:rFonts w:ascii="Calibri" w:hAnsi="Calibri" w:eastAsia="Calibri"/>
+          <w:b/>
+          <w:sz w:val="22"/>
+        </w:rPr>
+        <w:t>But the logical chain from the microscopic to the macroscopic had never been rigorously proved — it had been missing for 125 years.</w:t>
+      </w:r>
+    </w:p>
+    <w:p>
+      <w:pPr>
+        <w:spacing w:after="80" w:line="300" w:lineRule="auto"/>
+      </w:pPr>
+      <w:r>
+        <w:rPr>
+          <w:rFonts w:ascii="Calibri" w:hAnsi="Calibri" w:eastAsia="Calibri"/>
+          <w:sz w:val="22"/>
+        </w:rPr>
+        <w:t xml:space="preserve">Deng and his collaborators filled in that missing link: starting from Newton's hard-sphere model (microscopic), they rigorously obtained the Boltzmann equation (mesoscopic statistics), and then derived the fluid-mechanics equations (macroscopic). </w:t>
+      </w:r>
+      <w:r>
+        <w:rPr>
+          <w:rFonts w:ascii="Calibri" w:hAnsi="Calibri" w:eastAsia="Calibri"/>
+          <w:b/>
+          <w:sz w:val="22"/>
+        </w:rPr>
+        <w:t>This erected, between the microscopic and the macroscopic, a logically airtight bridge that was previously thought impossible.</w:t>
+      </w:r>
+      <w:r>
+        <w:rPr>
+          <w:rFonts w:ascii="Calibri" w:hAnsi="Calibri" w:eastAsia="Calibri"/>
+          <w:sz w:val="22"/>
+        </w:rPr>
+        <w:t xml:space="preserve"> This is the solution of the "narrow Hilbert sixth problem."</w:t>
+      </w:r>
+    </w:p>
+    <w:p>
+      <w:pPr>
+        <w:spacing w:after="80" w:line="300" w:lineRule="auto"/>
+      </w:pPr>
+      <w:r>
+        <w:rPr>
+          <w:rFonts w:ascii="Calibri" w:hAnsi="Calibri" w:eastAsia="Calibri"/>
+          <w:sz w:val="22"/>
+        </w:rPr>
+        <w:t xml:space="preserve">A romantic way to put it: </w:t>
+      </w:r>
+      <w:r>
+        <w:rPr>
+          <w:rFonts w:ascii="Calibri" w:hAnsi="Calibri" w:eastAsia="Calibri"/>
+          <w:b/>
+          <w:sz w:val="22"/>
+        </w:rPr>
+        <w:t>Deng recovered the arrow of time for Newtonian mechanics.</w:t>
+      </w:r>
+      <w:r>
+        <w:rPr>
+          <w:rFonts w:ascii="Calibri" w:hAnsi="Calibri" w:eastAsia="Calibri"/>
+          <w:sz w:val="22"/>
+        </w:rPr>
+        <w:t xml:space="preserve"> The motion of a single molecule has no direction, but countless molecules, through statistical regularity, "grow" an irreversible arrow of time — the most striking embodiment of "emergence."</w:t>
+      </w:r>
+    </w:p>
+    <w:p>
+      <w:pPr>
+        <w:spacing w:after="80" w:line="300" w:lineRule="auto"/>
+      </w:pPr>
+      <w:r>
+        <w:rPr>
+          <w:rFonts w:ascii="Calibri" w:hAnsi="Calibri" w:eastAsia="Calibri"/>
+          <w:sz w:val="22"/>
+        </w:rPr>
+        <w:t>Now, bring our gaze back to our own framework.</w:t>
+      </w:r>
+    </w:p>
+    <w:p>
+      <w:pPr>
+        <w:spacing w:after="80" w:line="300" w:lineRule="auto"/>
+      </w:pPr>
+      <w:r>
+        <w:rPr>
+          <w:rFonts w:ascii="Calibri" w:hAnsi="Calibri" w:eastAsia="Calibri"/>
+          <w:sz w:val="22"/>
+        </w:rPr>
+        <w:t xml:space="preserve">Deng proved with mathematics that "emergence" is not philosophical rhetoric but a rigorous fact: </w:t>
+      </w:r>
+      <w:r>
+        <w:rPr>
+          <w:rFonts w:ascii="Calibri" w:hAnsi="Calibri" w:eastAsia="Calibri"/>
+          <w:b/>
+          <w:sz w:val="22"/>
+        </w:rPr>
+        <w:t>microscopic particles can emerge into macroscopic fluids, temperature, and the arrow of time.</w:t>
+      </w:r>
+    </w:p>
+    <w:p>
+      <w:pPr>
+        <w:spacing w:after="80" w:line="300" w:lineRule="auto"/>
+      </w:pPr>
+      <w:r>
+        <w:rPr>
+          <w:rFonts w:ascii="Calibri" w:hAnsi="Calibri" w:eastAsia="Calibri"/>
+          <w:sz w:val="22"/>
+        </w:rPr>
+        <w:t xml:space="preserve">And our framework is asking a deeper question: </w:t>
+      </w:r>
+      <w:r>
+        <w:rPr>
+          <w:rFonts w:ascii="Calibri" w:hAnsi="Calibri" w:eastAsia="Calibri"/>
+          <w:b/>
+          <w:sz w:val="22"/>
+        </w:rPr>
+        <w:t>if temperature is emergent, if fluids are emergent, if the arrow of time is emergent, then is "spacetime" itself also emergent from something more fundamental?</w:t>
+      </w:r>
+    </w:p>
+    <w:p>
+      <w:pPr>
+        <w:spacing w:after="80" w:line="300" w:lineRule="auto"/>
+      </w:pPr>
+      <w:r>
+        <w:rPr>
+          <w:rFonts w:ascii="Calibri" w:hAnsi="Calibri" w:eastAsia="Calibri"/>
+          <w:sz w:val="22"/>
+        </w:rPr>
+        <w:t xml:space="preserve">Our answer is: </w:t>
+      </w:r>
+      <w:r>
+        <w:rPr>
+          <w:rFonts w:ascii="Calibri" w:hAnsi="Calibri" w:eastAsia="Calibri"/>
+          <w:b/>
+          <w:sz w:val="22"/>
+        </w:rPr>
+        <w:t>yes. That more fundamental thing is "change."</w:t>
+      </w:r>
+      <w:r>
+        <w:rPr>
+          <w:rFonts w:ascii="Calibri" w:hAnsi="Calibri" w:eastAsia="Calibri"/>
+          <w:sz w:val="22"/>
+        </w:rPr>
+        <w:t xml:space="preserve"> We do not need to assume the "stage" of spacetime exists first — starting directly from "the spectrum of change," spacetime, gravity, gauge fields, and matter all "grow" out of "change."</w:t>
+      </w:r>
+    </w:p>
+    <w:p>
+      <w:pPr>
+        <w:spacing w:after="80" w:line="300" w:lineRule="auto"/>
+      </w:pPr>
+      <w:r>
+        <w:rPr>
+          <w:rFonts w:ascii="Calibri" w:hAnsi="Calibri" w:eastAsia="Calibri"/>
+          <w:sz w:val="22"/>
+        </w:rPr>
+        <w:t>If Hilbert's sixth problem is "</w:t>
+      </w:r>
+      <w:r>
+        <w:rPr>
+          <w:rFonts w:ascii="Calibri" w:hAnsi="Calibri" w:eastAsia="Calibri"/>
+          <w:b/>
+          <w:sz w:val="22"/>
+        </w:rPr>
+        <w:t>finding axioms for the known physical world</w:t>
+      </w:r>
+      <w:r>
+        <w:rPr>
+          <w:rFonts w:ascii="Calibri" w:hAnsi="Calibri" w:eastAsia="Calibri"/>
+          <w:sz w:val="22"/>
+        </w:rPr>
+        <w:t xml:space="preserve">," then our framework asks a more fundamental question: </w:t>
+      </w:r>
+      <w:r>
+        <w:rPr>
+          <w:rFonts w:ascii="Calibri" w:hAnsi="Calibri" w:eastAsia="Calibri"/>
+          <w:b/>
+          <w:sz w:val="22"/>
+        </w:rPr>
+        <w:t>"before the 'physical world' appears, what is the axiom?"</w:t>
+      </w:r>
+      <w:r>
+        <w:rPr>
+          <w:rFonts w:ascii="Calibri" w:hAnsi="Calibri" w:eastAsia="Calibri"/>
+          <w:sz w:val="22"/>
+        </w:rPr>
+        <w:t xml:space="preserve"> Our answer is: </w:t>
+      </w:r>
+      <w:r>
+        <w:rPr>
+          <w:rFonts w:ascii="Calibri" w:hAnsi="Calibri" w:eastAsia="Calibri"/>
+          <w:b/>
+          <w:sz w:val="22"/>
+        </w:rPr>
+        <w:t>change. The spectrum of change is the axiom, and all of physics is its corollary.</w:t>
+      </w:r>
+    </w:p>
+    <w:p>
+      <w:pPr>
+        <w:spacing w:after="80" w:line="300" w:lineRule="auto"/>
+      </w:pPr>
+      <w:r>
+        <w:rPr>
+          <w:rFonts w:ascii="Calibri" w:hAnsi="Calibri" w:eastAsia="Calibri"/>
+          <w:sz w:val="22"/>
+        </w:rPr>
+        <w:t xml:space="preserve">Deng put the final full stop on "how the microscopic emerges into the macroscopic"; our framework is writing the opening line of "how change emerges into spacetime." </w:t>
+      </w:r>
+      <w:r>
+        <w:rPr>
+          <w:rFonts w:ascii="Calibri" w:hAnsi="Calibri" w:eastAsia="Calibri"/>
+          <w:b/>
+          <w:sz w:val="22"/>
+        </w:rPr>
+        <w:t>This, in one word, is an axiom that solves everything.</w:t>
       </w:r>
     </w:p>
     <w:p>

</xml_diff>

<commit_message>
Add cluster-decay/EW-precision/crosscheck modules; refresh docs PDFs and ledger
</commit_message>
<xml_diff>
--- a/docs/From Change to Everything - A Popular Science Introduction.docx
+++ b/docs/From Change to Everything - A Popular Science Introduction.docx
@@ -189,6 +189,30 @@
       </w:r>
     </w:p>
     <w:p>
+      <w:r>
+        <w:rPr>
+          <w:b w:val="0"/>
+        </w:rPr>
+        <w:t>This introduction follows two parallel threads, and the reader is invited to keep them in mind throughout.</w:t>
+      </w:r>
+    </w:p>
+    <w:p>
+      <w:r>
+        <w:rPr>
+          <w:b w:val="0"/>
+        </w:rPr>
+        <w:t>The first thread is about “space”: spacetime does not exist, yet the path-integral measure of standard quantum field theory cannot be defined without it. The way out is to change the analysis domain — from “fields in spacetime” to “the spectrum of change” — much as signal processing moves a problem from the time domain to the frequency domain (Chapters 2 and 4).</w:t>
+      </w:r>
+    </w:p>
+    <w:p>
+      <w:r>
+        <w:rPr>
+          <w:b w:val="0"/>
+        </w:rPr>
+        <w:t>The second thread is about “field”: constructing the field directly is hard and divergent everywhere — the difficulty of the Yang–Mills conjecture. The way out is to reverse the starting point: change is the substance and the field is derived; and the smallest, most fundamental change is pinned down uniquely by a single axiom, which we call the disorder axiom (Chapters 3 and 6).</w:t>
+      </w:r>
+    </w:p>
+    <w:p>
       <w:pPr>
         <w:spacing w:before="120" w:after="120"/>
         <w:pBdr>
@@ -2501,6 +2525,302 @@
     </w:p>
     <w:p>
       <w:pPr>
+        <w:pStyle w:val="Heading3"/>
+      </w:pPr>
+      <w:r>
+        <w:rPr>
+          <w:b w:val="0"/>
+        </w:rPr>
+        <w:t>Changing the analysis domain: from the “time domain” to the “frequency domain”</w:t>
+      </w:r>
+    </w:p>
+    <w:p>
+      <w:r>
+        <w:rPr>
+          <w:b w:val="0"/>
+        </w:rPr>
+        <w:t>This chain of logic has a familiar parallel: signal processing.</w:t>
+      </w:r>
+    </w:p>
+    <w:p>
+      <w:r>
+        <w:rPr>
+          <w:b w:val="0"/>
+        </w:rPr>
+        <w:t>A complicated sound signal is a tangled mess on the time axis; but one Fourier transform later, decomposed by frequency, it becomes a handful of clean “pure tones.” No information is lost — only the basis has changed: instead of asking “how loud at each moment,” one asks “how strong at each frequency.” Filtering and compression, painful in the time domain, become startlingly simple in the frequency domain.</w:t>
+      </w:r>
+    </w:p>
+    <w:p>
+      <w:r>
+        <w:rPr>
+          <w:b w:val="0"/>
+        </w:rPr>
+        <w:t>Standard quantum field theory is a “time-domain” analysis: fields are defined at spacetime points, and the path integral sums over infinitely many histories — the QFT version of “reading the waveform,” and the root of the measure problem and the divergences. Our spectral method is a “frequency-domain” analysis: we look not at spacetime points but at vibrational modes. Physical quantities change from “functions of spacetime points” into “sums of spectral eigenvalues”; the path integral becomes a discrete series, and “solving differential equations” becomes “summing a series.”</w:t>
+      </w:r>
+    </w:p>
+    <w:p>
+      <w:r>
+        <w:rPr>
+          <w:b w:val="0"/>
+        </w:rPr>
+        <w:t>But there is a fundamental inversion: in signal processing the time domain is “real” and the frequency domain is a tool; we turn this around — the spectrum is the reality, and spacetime is merely the “composite waveform” that all the modes superpose into. This is the mathematical landing point of Chapter 1’s conclusion (spacetime does not exist).</w:t>
+      </w:r>
+    </w:p>
+    <w:p>
+      <w:r>
+        <w:rPr>
+          <w:b w:val="0"/>
+        </w:rPr>
+        <w:t>The inversion has a price: the hardest thing for mainstream physics to accept is causality and locality. Whether two events one light-year apart are causally connected is decided in the time domain by distance; in the spectral domain it must be re-derived — the “neighbour relations” of the spectrum must translate, in the emergent spacetime, into “spacelike separation.” This is the hardest bone of the whole method, and the part our papers address with the Osterwalder–Schrader reconstruction.</w:t>
+      </w:r>
+    </w:p>
+    <w:tbl>
+      <w:tblPr>
+        <w:tblStyle w:val="LightGrid-Accent1"/>
+        <w:tblW w:type="auto" w:w="0"/>
+        <w:tblLook w:firstColumn="1" w:firstRow="1" w:lastColumn="0" w:lastRow="0" w:noHBand="0" w:noVBand="1" w:val="04A0"/>
+      </w:tblPr>
+      <w:tblGrid>
+        <w:gridCol w:w="2880"/>
+        <w:gridCol w:w="2880"/>
+        <w:gridCol w:w="2880"/>
+      </w:tblGrid>
+      <w:tr>
+        <w:tc>
+          <w:tcPr>
+            <w:tcW w:type="dxa" w:w="2880"/>
+          </w:tcPr>
+          <w:p>
+            <w:r>
+              <w:rPr>
+                <w:b/>
+              </w:rPr>
+              <w:t>Dimension</w:t>
+            </w:r>
+          </w:p>
+        </w:tc>
+        <w:tc>
+          <w:tcPr>
+            <w:tcW w:type="dxa" w:w="2880"/>
+          </w:tcPr>
+          <w:p>
+            <w:r>
+              <w:rPr>
+                <w:b/>
+              </w:rPr>
+              <w:t>Signal processing (time → frequency)</w:t>
+            </w:r>
+          </w:p>
+        </w:tc>
+        <w:tc>
+          <w:tcPr>
+            <w:tcW w:type="dxa" w:w="2880"/>
+          </w:tcPr>
+          <w:p>
+            <w:r>
+              <w:rPr>
+                <w:b/>
+              </w:rPr>
+              <w:t>Our spectral method (coordinates → spectrum)</w:t>
+            </w:r>
+          </w:p>
+        </w:tc>
+      </w:tr>
+      <w:tr>
+        <w:tc>
+          <w:tcPr>
+            <w:tcW w:type="dxa" w:w="2880"/>
+          </w:tcPr>
+          <w:p>
+            <w:r>
+              <w:t>Original basis</w:t>
+            </w:r>
+          </w:p>
+        </w:tc>
+        <w:tc>
+          <w:tcPr>
+            <w:tcW w:type="dxa" w:w="2880"/>
+          </w:tcPr>
+          <w:p>
+            <w:r>
+              <w:t>Time domain (the time axis)</w:t>
+            </w:r>
+          </w:p>
+        </w:tc>
+        <w:tc>
+          <w:tcPr>
+            <w:tcW w:type="dxa" w:w="2880"/>
+          </w:tcPr>
+          <w:p>
+            <w:r>
+              <w:t>Coordinate space (spacetime points)</w:t>
+            </w:r>
+          </w:p>
+        </w:tc>
+      </w:tr>
+      <w:tr>
+        <w:tc>
+          <w:tcPr>
+            <w:tcW w:type="dxa" w:w="2880"/>
+          </w:tcPr>
+          <w:p>
+            <w:r>
+              <w:t>Transformed basis</w:t>
+            </w:r>
+          </w:p>
+        </w:tc>
+        <w:tc>
+          <w:tcPr>
+            <w:tcW w:type="dxa" w:w="2880"/>
+          </w:tcPr>
+          <w:p>
+            <w:r>
+              <w:t>Frequency domain (the frequency axis)</w:t>
+            </w:r>
+          </w:p>
+        </w:tc>
+        <w:tc>
+          <w:tcPr>
+            <w:tcW w:type="dxa" w:w="2880"/>
+          </w:tcPr>
+          <w:p>
+            <w:r>
+              <w:t>Spectral space (the vibrational modes of the internal space)</w:t>
+            </w:r>
+          </w:p>
+        </w:tc>
+      </w:tr>
+      <w:tr>
+        <w:tc>
+          <w:tcPr>
+            <w:tcW w:type="dxa" w:w="2880"/>
+          </w:tcPr>
+          <w:p>
+            <w:r>
+              <w:t>Core difficulty</w:t>
+            </w:r>
+          </w:p>
+        </w:tc>
+        <w:tc>
+          <w:tcPr>
+            <w:tcW w:type="dxa" w:w="2880"/>
+          </w:tcPr>
+          <w:p>
+            <w:r>
+              <w:t>Superposition of complex signals, noise filtering</w:t>
+            </w:r>
+          </w:p>
+        </w:tc>
+        <w:tc>
+          <w:tcPr>
+            <w:tcW w:type="dxa" w:w="2880"/>
+          </w:tcPr>
+          <w:p>
+            <w:r>
+              <w:t>The divergences of QFT, the nonexistent path-integral measure</w:t>
+            </w:r>
+          </w:p>
+        </w:tc>
+      </w:tr>
+      <w:tr>
+        <w:tc>
+          <w:tcPr>
+            <w:tcW w:type="dxa" w:w="2880"/>
+          </w:tcPr>
+          <w:p>
+            <w:r>
+              <w:t>Solution</w:t>
+            </w:r>
+          </w:p>
+        </w:tc>
+        <w:tc>
+          <w:tcPr>
+            <w:tcW w:type="dxa" w:w="2880"/>
+          </w:tcPr>
+          <w:p>
+            <w:r>
+              <w:t>Fourier transform: convolution becomes multiplication</w:t>
+            </w:r>
+          </w:p>
+        </w:tc>
+        <w:tc>
+          <w:tcPr>
+            <w:tcW w:type="dxa" w:w="2880"/>
+          </w:tcPr>
+          <w:p>
+            <w:r>
+              <w:t>Spectral sum: the path integral becomes a discrete series</w:t>
+            </w:r>
+          </w:p>
+        </w:tc>
+      </w:tr>
+      <w:tr>
+        <w:tc>
+          <w:tcPr>
+            <w:tcW w:type="dxa" w:w="2880"/>
+          </w:tcPr>
+          <w:p>
+            <w:r>
+              <w:t>Key operation</w:t>
+            </w:r>
+          </w:p>
+        </w:tc>
+        <w:tc>
+          <w:tcPr>
+            <w:tcW w:type="dxa" w:w="2880"/>
+          </w:tcPr>
+          <w:p>
+            <w:r>
+              <w:t>Fourier transform</w:t>
+            </w:r>
+          </w:p>
+        </w:tc>
+        <w:tc>
+          <w:tcPr>
+            <w:tcW w:type="dxa" w:w="2880"/>
+          </w:tcPr>
+          <w:p>
+            <w:r>
+              <w:t>Spectral decomposition / spectral sum</w:t>
+            </w:r>
+          </w:p>
+        </w:tc>
+      </w:tr>
+      <w:tr>
+        <w:tc>
+          <w:tcPr>
+            <w:tcW w:type="dxa" w:w="2880"/>
+          </w:tcPr>
+          <w:p>
+            <w:r>
+              <w:t>Physical meaning</w:t>
+            </w:r>
+          </w:p>
+        </w:tc>
+        <w:tc>
+          <w:tcPr>
+            <w:tcW w:type="dxa" w:w="2880"/>
+          </w:tcPr>
+          <w:p>
+            <w:r>
+              <w:t>“Wave” becomes “frequency”</w:t>
+            </w:r>
+          </w:p>
+        </w:tc>
+        <w:tc>
+          <w:tcPr>
+            <w:tcW w:type="dxa" w:w="2880"/>
+          </w:tcPr>
+          <w:p>
+            <w:r>
+              <w:t>“Field” becomes “vibrational modes (particle states)”</w:t>
+            </w:r>
+          </w:p>
+        </w:tc>
+      </w:tr>
+    </w:tbl>
+    <w:p>
+      <w:pPr>
         <w:spacing w:before="120" w:after="120"/>
         <w:pBdr>
           <w:bottom w:val="single" w:sz="6" w:space="1" w:color="AAAAAA"/>
@@ -3120,6 +3440,14 @@
       </w:r>
     </w:p>
     <w:p>
+      <w:r>
+        <w:rPr>
+          <w:b w:val="0"/>
+        </w:rPr>
+        <w:t>What, then, does this “change” concretely amount to? Chapter 4 explains how to describe change with the spectrum; Chapter 6 gives the full answer — the smallest, most fundamental change is pinned down uniquely by a single axiom, which we call the disorder axiom.</w:t>
+      </w:r>
+    </w:p>
+    <w:p>
       <w:pPr>
         <w:pStyle w:val="Heading3"/>
         <w:spacing w:before="200" w:after="120"/>
@@ -4683,18 +5011,21 @@
       </w:pPr>
       <w:r>
         <w:rPr>
-          <w:rFonts w:ascii="Calibri" w:hAnsi="Calibri" w:eastAsia="Calibri"/>
-          <w:sz w:val="22"/>
-        </w:rPr>
-        <w:t xml:space="preserve">Our answer: </w:t>
-      </w:r>
-      <w:r>
-        <w:rPr>
-          <w:rFonts w:ascii="Calibri" w:hAnsi="Calibri" w:eastAsia="Calibri"/>
-          <w:b/>
-          <w:sz w:val="22"/>
-        </w:rPr>
-        <w:t>the spectrum of an internal compact space (RP³).</w:t>
+          <w:b w:val="0"/>
+        </w:rPr>
+        <w:t xml:space="preserve">Our answer is a one-sentence axiom, which we call the </w:t>
+      </w:r>
+      <w:r>
+        <w:rPr>
+          <w:b/>
+        </w:rPr>
+        <w:t>disorder axiom</w:t>
+      </w:r>
+      <w:r>
+        <w:rPr>
+          <w:b w:val="0"/>
+        </w:rPr>
+        <w:t>:</w:t>
       </w:r>
     </w:p>
     <w:p>
@@ -4703,10 +5034,9 @@
       </w:pPr>
       <w:r>
         <w:rPr>
-          <w:rFonts w:ascii="Calibri" w:hAnsi="Calibri" w:eastAsia="Calibri"/>
-          <w:sz w:val="22"/>
-        </w:rPr>
-        <w:t>"Compact" means it is bounded and closed — like a drumhead, whose vibrational modes are discrete and finite. RP³ is the most natural compact internal space (it is the three-dimensional sphere S³ with antipodal points "glued" together, which physically corresponds to the fact of "chirality" — that nature distinguishes left from right).</w:t>
+          <w:b/>
+        </w:rPr>
+        <w:t>&gt; There exists a minimal, unbiased, spin-1/2 change.</w:t>
       </w:r>
     </w:p>
     <w:p>
@@ -4715,10 +5045,99 @@
       </w:pPr>
       <w:r>
         <w:rPr>
-          <w:rFonts w:ascii="Calibri" w:hAnsi="Calibri" w:eastAsia="Calibri"/>
-          <w:sz w:val="22"/>
-        </w:rPr>
-        <w:t>Starting from the spectrum of RP³ is starting from a "smallest, most symmetric set of changes." Why "smallest"? Because it is one of the simplest closed three-dimensional spaces. Why "most symmetric"? Because it inherits the high symmetry of the sphere, constrained in the simplest possible way by Z₂ (antipodal identification).</w:t>
+          <w:b w:val="0"/>
+        </w:rPr>
+        <w:t>Unfolded, it has three clauses:</w:t>
+      </w:r>
+    </w:p>
+    <w:p>
+      <w:r>
+        <w:rPr>
+          <w:b/>
+        </w:rPr>
+        <w:t xml:space="preserve">(A1) Existence: </w:t>
+      </w:r>
+      <w:r>
+        <w:rPr>
+          <w:b w:val="0"/>
+        </w:rPr>
+        <w:t>the change exists. This only says that our starting point is not “nothing,” but change itself.</w:t>
+      </w:r>
+    </w:p>
+    <w:p>
+      <w:r>
+        <w:rPr>
+          <w:b/>
+        </w:rPr>
+        <w:t xml:space="preserve">(A2) The quantum unit is spin-1/2: </w:t>
+      </w:r>
+      <w:r>
+        <w:rPr>
+          <w:b w:val="0"/>
+        </w:rPr>
+        <w:t>the carrier of the change is a two-dimensional complex space — the smallest unit of quantum mechanics. Together with “the symmetry group is minimal,” this uniquely pins the symmetry group to SU(2): a faithful continuous irreducible representation on a two-dimensional complex carrier can only have SU(2) as its symmetry group (also known as Spin(3)).</w:t>
+      </w:r>
+    </w:p>
+    <w:p>
+      <w:r>
+        <w:rPr>
+          <w:b/>
+        </w:rPr>
+        <w:t xml:space="preserve">(A3) Unbiasedness: </w:t>
+      </w:r>
+      <w:r>
+        <w:rPr>
+          <w:b w:val="0"/>
+        </w:rPr>
+        <w:t>the change plays no favourites with its symmetry group — there is no hidden preference. Together with the maximum-entropy principle, this uniquely gives a Gaussian distribution — a “structureless” random field (the scale field).</w:t>
+      </w:r>
+    </w:p>
+    <w:p>
+      <w:r>
+        <w:rPr>
+          <w:b w:val="0"/>
+        </w:rPr>
+        <w:t>Simple as it sounds, this axiom is a derivation machine:</w:t>
+      </w:r>
+    </w:p>
+    <w:p>
+      <w:r>
+        <w:rPr>
+          <w:b w:val="0"/>
+        </w:rPr>
+        <w:t>• spin-1/2 naturally distinguishes left from right (the chiral structure), and the chiral structure requires the symmetry group to be Spin(4);</w:t>
+      </w:r>
+    </w:p>
+    <w:p>
+      <w:r>
+        <w:rPr>
+          <w:b w:val="0"/>
+        </w:rPr>
+        <w:t>• gluing antipodal points together (z ↦ −z) turns the chiral structure into geometry: the internal space is RP³ = S³/Z₂ — this is where RP³ comes from;</w:t>
+      </w:r>
+    </w:p>
+    <w:p>
+      <w:r>
+        <w:rPr>
+          <w:b w:val="0"/>
+        </w:rPr>
+        <w:t>• “compact” means bounded and closed, like a drumhead, so the vibrational modes are discrete and finite. The “spectrum of the smallest change” is therefore the spectrum of RP³ — a discrete set of frequencies.</w:t>
+      </w:r>
+    </w:p>
+    <w:p>
+      <w:r>
+        <w:rPr>
+          <w:b w:val="0"/>
+        </w:rPr>
+        <w:t>So the disorder axiom is the single starting point of the whole framework: a minimal, unbiased, spin-1/2 change. Everything that follows — the gauge group, the three fermion generations, the masses, the couplings — emerges from this axiom. Without it, RP³ would be just “some space picked by hand”; with it, RP³ is derived uniquely.</w:t>
+      </w:r>
+    </w:p>
+    <w:p>
+      <w:r>
+        <w:rPr>
+          <w:b w:val="0"/>
+        </w:rPr>
+        <w:t>Starting from the spectrum of RP³ is therefore starting from a “smallest, most symmetric set of changes”: smallest, because it is one of the simplest closed three-dimensional spaces; most symmetric, because it inherits the sphere’s high symmetry, constrained by Z₂ (antipodal identification) in the simplest way.</w:t>
       </w:r>
     </w:p>
     <w:p>
@@ -8882,18 +9301,9 @@
       </w:pPr>
       <w:r>
         <w:rPr>
-          <w:rFonts w:ascii="Calibri" w:hAnsi="Calibri" w:eastAsia="Calibri"/>
-          <w:sz w:val="22"/>
-        </w:rPr>
-        <w:t xml:space="preserve">&gt; </w:t>
-      </w:r>
-      <w:r>
-        <w:rPr>
-          <w:rFonts w:ascii="Calibri" w:hAnsi="Calibri" w:eastAsia="Calibri"/>
-          <w:b/>
-          <w:sz w:val="22"/>
-        </w:rPr>
-        <w:t>Change is the substance, the spectrum is the language of change, and the field, geometry, gauge, gravity, matter — even spacetime itself — are all structures that emerge from the spectrum of the smallest change.</w:t>
+          <w:b w:val="0"/>
+        </w:rPr>
+        <w:t>&gt; Change is the substance, the spectrum is the language of change, and the field, geometry, gauge, gravity, matter — even spacetime itself — are all structures that emerge from the spectrum of the smallest change fixed by the disorder axiom (a minimal, unbiased, spin-1/2 change).</w:t>
       </w:r>
     </w:p>
     <w:p>
@@ -9223,6 +9633,22 @@
           <w:sz w:val="22"/>
         </w:rPr>
         <w:t xml:space="preserve"> collective behavior that cannot be found microscopically but truly exists macroscopically. Like temperature relative to molecules.</w:t>
+      </w:r>
+    </w:p>
+    <w:p>
+      <w:r>
+        <w:rPr>
+          <w:b w:val="0"/>
+        </w:rPr>
+        <w:t>• Disorder axiom: the single starting point of the framework — “there exists a minimal, unbiased, spin-1/2 change.”</w:t>
+      </w:r>
+    </w:p>
+    <w:p>
+      <w:r>
+        <w:rPr>
+          <w:b w:val="0"/>
+        </w:rPr>
+        <w:t>• Changing the analysis domain: moving a problem from the “spacetime coordinate” basis to the “vibrational mode (spectrum)” basis, like moving a time-domain problem to the frequency domain in signal processing.</w:t>
       </w:r>
     </w:p>
     <w:p>

</xml_diff>